<commit_message>
Bake QA approve/reject stamp into base PDF at lifecycle transitions
Add a {{ qa_stamp }} InlineImage placeholder (same mechanism as signatures):
- QA-approved & active -> qaapproved.png embedded at on_submit render
- Obsolete (cancelled or auto-expired) -> qarejected.png re-stamped into PDF

on_cancel now re-renders the base PDF so the rejected stamp is baked in
(guarded/logged so a LibreOffice outage can't trap a cancellation). A new
daily scheduler_events job, expire_gmp_documents(), obsoletes any active
submitted document past its expiry_date and re-stamps it (docstatus stays 1;
per-document commit/rollback isolates failures).

Stamp assets moved into the app package (dms/stamps/) so get_app_path
resolves them on any host. qa_stamp registered in TEMPLATE_FIELDS for the
mapping UI; sample docx updated with the {{ qa_stamp }} tag for testing.

Co-Authored-By: Claude Opus 4.8 <noreply@anthropic.com>
</commit_message>
<xml_diff>
--- a/sample_gmp_template.docx
+++ b/sample_gmp_template.docx
@@ -107,6 +107,14 @@
         <w:t xml:space="preserve">QA Approved by: {{ approved_by_name }}   Signature: {{ qa_signature }}</w:t>
       </w:r>
     </w:p>
+    <w:p>
+      <w:r>
+        <w:rPr>
+          <w:sz w:val="22"/>
+        </w:rPr>
+        <w:t>QA Status: {{ qa_stamp }}</w:t>
+      </w:r>
+    </w:p>
     <w:sectPr/>
   </w:body>
 </w:document>

</xml_diff>